<commit_message>
Add confirmed WebSockets, Vercel, and shared skills to the backend CV.
Co-authored-by: Mohamed Mostafa <dev.xmuhameed@gmail.com>
</commit_message>
<xml_diff>
--- a/Mohamed_Mostafa-Backend_Developer.docx
+++ b/Mohamed_Mostafa-Backend_Developer.docx
@@ -93,7 +93,7 @@
           <w:sz w:val="22"/>
           <w:u w:val="none"/>
         </w:rPr>
-        <w:t>Back-End Developer with 4+ years of experience building secure back end services and server-side applications with Node.js, NestJS, Express.js, TypeScript, and JavaScript (ES6+). Designs SQL data models in PostgreSQL with Prisma ORM, works with MySQL and MongoDB, and implements JSON Web Token (JWT) authentication and authorization. Delivers payment integrations and performance improvements for enterprise and e-commerce platforms through REST (Representational State Transfer) application programming interfaces (APIs), with cross-functional teams in Agile environments.</w:t>
+        <w:t>Back-End Developer with 4+ years of experience building secure back end services and server-side applications with Node.js, NestJS, Express.js, TypeScript, and JavaScript (ES6+). Designs SQL data models in PostgreSQL with Prisma ORM, works with MySQL and MongoDB, and implements JSON Web Token (JWT) authentication and authorization. Delivers WebSockets (Socket.io) for real-time features, payment integrations, and REST (Representational State Transfer) application programming interfaces (APIs). Deploys on Vercel with cross-functional Agile teams.</w:t>
       </w:r>
     </w:p>
     <w:p>
@@ -173,7 +173,7 @@
           <w:sz w:val="22"/>
           <w:u w:val="none"/>
         </w:rPr>
-        <w:t>Node.js, NestJS (Nest.js), Express.js, REST APIs, Prisma ORM (object-relational mapping), secure JSON Web Token (JWT) authentication and authorization</w:t>
+        <w:t>Node.js, NestJS (Nest.js), Express.js, REST APIs, WebSockets (Socket.io), Prisma ORM (object-relational mapping), secure JSON Web Token (JWT) authentication and authorization</w:t>
       </w:r>
     </w:p>
     <w:p>
@@ -231,7 +231,7 @@
           <w:sz w:val="22"/>
           <w:u w:val="none"/>
         </w:rPr>
-        <w:t>React.js, Next.js, Tailwind CSS, Redux Toolkit and Zustand for state management, Bootstrap, Three.js, responsive web design (HTML and CSS)</w:t>
+        <w:t>React.js, Next.js (server-side rendering (SSR) and App Router), Tailwind CSS, SCSS (Sass), React Hook Form, Zod, Redux Toolkit and Zustand for state management, Bootstrap, Three.js, responsive web design (HTML and CSS)</w:t>
       </w:r>
     </w:p>
     <w:p>
@@ -260,7 +260,7 @@
           <w:sz w:val="22"/>
           <w:u w:val="none"/>
         </w:rPr>
-        <w:t>Git, GitHub (version control), CI/CD (continuous integration and continuous delivery) with GitHub Actions, Postman, Figma, Stripe, Tabby, Google Analytics, Meta Pixel, Agile</w:t>
+        <w:t>Git, GitHub (version control), CI/CD (continuous integration and continuous delivery) with GitHub Actions, Vercel, Postman, Figma, Stripe, Tabby, Google Analytics, Meta Pixel, Agile</w:t>
       </w:r>
     </w:p>
     <w:p>
@@ -550,7 +550,7 @@
           <w:sz w:val="22"/>
           <w:u w:val="none"/>
         </w:rPr>
-        <w:t>• Built real-time dashboards with NestJS and optimized backend performance for PostgreSQL enterprise systems.</w:t>
+        <w:t>• Built real-time dashboards with NestJS and WebSockets (Socket.io), and optimized backend performance for PostgreSQL enterprise systems.</w:t>
       </w:r>
     </w:p>
     <w:p>

</xml_diff>

<commit_message>
Add xmuhameed.com to the CV contact line.
Co-authored-by: Mohamed Mostafa <dev.xmuhameed@gmail.com>
</commit_message>
<xml_diff>
--- a/Mohamed_Mostafa-Backend_Developer.docx
+++ b/Mohamed_Mostafa-Backend_Developer.docx
@@ -50,10 +50,10 @@
           <w:b w:val="0"/>
           <w:i w:val="0"/>
           <w:color w:val="000000"/>
-          <w:sz w:val="22"/>
+          <w:sz w:val="20"/>
           <w:u w:val="none"/>
         </w:rPr>
-        <w:t>Sharjah, UAE  |  +971 50 593 4245  |  dev.xmuhameed@gmail.com  |  linkedin.com/in/xmuhameed</w:t>
+        <w:t>Sharjah, UAE | +971 50 593 4245 | dev.xmuhameed@gmail.com | linkedin.com/in/xmuhameed | xmuhameed.com</w:t>
       </w:r>
     </w:p>
     <w:p>

</xml_diff>

<commit_message>
Redesign CVs: darker 10.5pt Calibri, 1 page, fix LinkedIn /in/ URL
</commit_message>
<xml_diff>
--- a/Mohamed_Mostafa-Backend_Developer.docx
+++ b/Mohamed_Mostafa-Backend_Developer.docx
@@ -5,20 +5,19 @@
     <w:p>
       <w:pPr>
         <w:pStyle w:val="Subtitle"/>
-        <w:rPr>
-          <w:rFonts w:asciiTheme="majorHAnsi" w:eastAsiaTheme="majorEastAsia" w:hAnsiTheme="majorHAnsi" w:cstheme="majorBidi"/>
+        <w:spacing w:before="0" w:after="20" w:line="240" w:lineRule="auto"/>
+        <w:rPr>
+          <w:rFonts w:ascii="Calibri" w:hAnsi="Calibri" w:cs="Calibri" w:eastAsia="Calibri"/>
           <w:b/>
-          <w:sz w:val="44"/>
-          <w:szCs w:val="56"/>
-          <w:lang w:val="en-AE"/>
-        </w:rPr>
-      </w:pPr>
-      <w:r>
-        <w:rPr>
-          <w:rFonts w:asciiTheme="majorHAnsi" w:eastAsiaTheme="majorEastAsia" w:hAnsiTheme="majorHAnsi" w:cstheme="majorBidi"/>
+          <w:lang w:val="en-AE"/>
+        </w:rPr>
+      </w:pPr>
+      <w:r>
+        <w:rPr>
+          <w:rFonts w:ascii="Calibri" w:hAnsi="Calibri" w:cs="Calibri" w:eastAsia="Calibri"/>
           <w:b/>
-          <w:sz w:val="44"/>
-          <w:szCs w:val="56"/>
+          <w:sz w:val="40"/>
+          <w:szCs w:val="40"/>
           <w:lang w:val="en-AE"/>
         </w:rPr>
         <w:t>MOHAMED MOSTAFA ABDELKADER</w:t>
@@ -26,32 +25,31 @@
     </w:p>
     <w:p>
       <w:pPr>
-        <w:rPr>
-          <w:rFonts w:cs="Open Sans"/>
+        <w:spacing w:before="0" w:after="20" w:line="240" w:lineRule="auto"/>
+        <w:rPr>
+          <w:rFonts w:ascii="Calibri" w:hAnsi="Calibri" w:cs="Calibri" w:eastAsia="Calibri"/>
           <w:caps/>
-          <w:color w:val="3A3A3A" w:themeColor="background2" w:themeShade="40"/>
-          <w:spacing w:val="20"/>
-          <w:szCs w:val="28"/>
-          <w:lang w:val="en-AE"/>
-        </w:rPr>
-      </w:pPr>
-      <w:r>
-        <w:rPr>
-          <w:rFonts w:cs="Open Sans"/>
+          <w:color w:val="1A1A1A"/>
+          <w:lang w:val="en-AE"/>
+        </w:rPr>
+      </w:pPr>
+      <w:r>
+        <w:rPr>
+          <w:rFonts w:ascii="Calibri" w:hAnsi="Calibri" w:cs="Calibri" w:eastAsia="Calibri"/>
           <w:caps/>
-          <w:color w:val="3A3A3A" w:themeColor="background2" w:themeShade="40"/>
-          <w:spacing w:val="20"/>
-          <w:szCs w:val="28"/>
+          <w:color w:val="1A1A1A"/>
+          <w:sz w:val="24"/>
+          <w:szCs w:val="24"/>
         </w:rPr>
         <w:t>BACKEND</w:t>
       </w:r>
       <w:r>
         <w:rPr>
-          <w:rFonts w:cs="Open Sans"/>
+          <w:rFonts w:ascii="Calibri" w:hAnsi="Calibri" w:cs="Calibri" w:eastAsia="Calibri"/>
           <w:caps/>
-          <w:color w:val="3A3A3A" w:themeColor="background2" w:themeShade="40"/>
-          <w:spacing w:val="20"/>
-          <w:szCs w:val="28"/>
+          <w:color w:val="1A1A1A"/>
+          <w:sz w:val="24"/>
+          <w:szCs w:val="24"/>
           <w:lang w:val="en-AE"/>
         </w:rPr>
         <w:t xml:space="preserve"> DEVELOPER</w:t>
@@ -68,14 +66,14 @@
         <w:r>
           <w:rPr>
             <w:rStyle w:val="Hyperlink"/>
-            <w:color w:val="auto"/>
+            <w:color w:val="1A1A1A"/>
           </w:rPr>
           <w:t>+971505934245</w:t>
         </w:r>
       </w:hyperlink>
       <w:r>
         <w:rPr>
-          <w:color w:val="auto"/>
+          <w:color w:val="1A1A1A"/>
         </w:rPr>
         <w:t xml:space="preserve"> </w:t>
       </w:r>
@@ -86,14 +84,14 @@
         <w:r>
           <w:rPr>
             <w:rStyle w:val="Hyperlink"/>
-            <w:color w:val="auto"/>
+            <w:color w:val="1A1A1A"/>
           </w:rPr>
           <w:t>dev.xmuhameed@gmail.com</w:t>
         </w:r>
       </w:hyperlink>
       <w:r>
         <w:rPr>
-          <w:color w:val="auto"/>
+          <w:color w:val="1A1A1A"/>
         </w:rPr>
         <w:t xml:space="preserve"> | </w:t>
       </w:r>
@@ -101,26 +99,26 @@
         <w:r>
           <w:rPr>
             <w:rStyle w:val="Hyperlink"/>
-            <w:color w:val="auto"/>
+            <w:color w:val="1A1A1A"/>
           </w:rPr>
-          <w:t>LinkedIn.com/xmuhameed</w:t>
+          <w:t>linkedin.com/in/xmuhameed</w:t>
         </w:r>
       </w:hyperlink>
       <w:r>
         <w:rPr>
-          <w:color w:val="auto"/>
+          <w:color w:val="1A1A1A"/>
         </w:rPr>
         <w:t xml:space="preserve"> </w:t>
       </w:r>
       <w:r>
         <w:rPr>
-          <w:color w:val="auto"/>
+          <w:color w:val="1A1A1A"/>
         </w:rPr>
         <w:t>|</w:t>
       </w:r>
       <w:r>
         <w:rPr>
-          <w:color w:val="auto"/>
+          <w:color w:val="1A1A1A"/>
         </w:rPr>
         <w:t xml:space="preserve"> </w:t>
       </w:r>
@@ -128,9 +126,9 @@
         <w:r>
           <w:rPr>
             <w:rStyle w:val="Hyperlink"/>
-            <w:color w:val="auto"/>
+            <w:color w:val="1A1A1A"/>
           </w:rPr>
-          <w:t>xmuhameed.me</w:t>
+          <w:t>xmuhameed.com</w:t>
         </w:r>
       </w:hyperlink>
       <w:r>
@@ -144,7 +142,7 @@
       </w:r>
       <w:r>
         <w:rPr>
-          <w:color w:val="auto"/>
+          <w:color w:val="1A1A1A"/>
         </w:rPr>
         <w:t>Dubai, UAE</w:t>
       </w:r>
@@ -154,23 +152,10 @@
         <w:pBdr>
           <w:bottom w:val="single" w:sz="8" w:space="1" w:color="auto"/>
         </w:pBdr>
-        <w:spacing w:line="240" w:lineRule="auto"/>
-        <w:rPr>
-          <w:rFonts w:ascii="Open Sans" w:hAnsi="Open Sans" w:cs="Open Sans"/>
-          <w:color w:val="3A3A3A" w:themeColor="background2" w:themeShade="40"/>
-          <w:sz w:val="8"/>
-          <w:szCs w:val="8"/>
-        </w:rPr>
-      </w:pPr>
-    </w:p>
-    <w:p>
-      <w:pPr>
-        <w:spacing w:line="240" w:lineRule="auto"/>
-        <w:rPr>
-          <w:rFonts w:ascii="Open Sans" w:hAnsi="Open Sans" w:cs="Open Sans"/>
-          <w:color w:val="3A3A3A" w:themeColor="background2" w:themeShade="40"/>
-          <w:sz w:val="14"/>
-          <w:szCs w:val="14"/>
+        <w:spacing w:before="0" w:after="60" w:line="120" w:lineRule="exact"/>
+        <w:rPr>
+          <w:rFonts w:ascii="Calibri" w:hAnsi="Calibri" w:cs="Calibri" w:eastAsia="Calibri"/>
+          <w:color w:val="1A1A1A"/>
         </w:rPr>
       </w:pPr>
     </w:p>
@@ -186,7 +171,6 @@
       <w:pPr>
         <w:pStyle w:val="Space"/>
         <w:rPr>
-          <w:sz w:val="22"/>
           <w:lang w:val="en-AE"/>
         </w:rPr>
       </w:pPr>
@@ -194,39 +178,24 @@
         <w:rPr>
           <w:b/>
           <w:bCs/>
-          <w:sz w:val="22"/>
         </w:rPr>
         <w:t>Backend Developer</w:t>
       </w:r>
       <w:r>
-        <w:rPr>
-          <w:sz w:val="22"/>
-        </w:rPr>
+        <w:rPr/>
         <w:t xml:space="preserve"> with 4+ years of experience designing scalable server-side applications using </w:t>
       </w:r>
       <w:r>
         <w:rPr>
           <w:b/>
           <w:bCs/>
-          <w:sz w:val="22"/>
         </w:rPr>
         <w:t>Node.js, NestJS, Express.js, Prisma ORM, PostgreSQL, and MySQL</w:t>
       </w:r>
       <w:r>
-        <w:rPr>
-          <w:sz w:val="22"/>
-        </w:rPr>
+        <w:rPr/>
         <w:t>. Experienced in building secure RESTful APIs, database design, authentication systems, payment gateway integrations, and performance optimization for enterprise and e-commerce platforms.</w:t>
       </w:r>
-    </w:p>
-    <w:p>
-      <w:pPr>
-        <w:pStyle w:val="Space"/>
-        <w:rPr>
-          <w:sz w:val="22"/>
-          <w:lang w:val="en-AE"/>
-        </w:rPr>
-      </w:pPr>
     </w:p>
     <w:p>
       <w:pPr>
@@ -343,11 +312,6 @@
     </w:p>
     <w:p>
       <w:pPr>
-        <w:pStyle w:val="List"/>
-      </w:pPr>
-    </w:p>
-    <w:p>
-      <w:pPr>
         <w:pStyle w:val="Heading1"/>
       </w:pPr>
       <w:r>
@@ -370,152 +334,95 @@
       <w:pPr>
         <w:pStyle w:val="Space"/>
         <w:jc w:val="left"/>
-        <w:rPr>
-          <w:sz w:val="22"/>
-        </w:rPr>
+        <w:rPr/>
       </w:pPr>
       <w:r>
         <w:rPr>
           <w:b/>
           <w:bCs/>
-          <w:sz w:val="22"/>
-        </w:rPr>
-        <w:t>Frontend:</w:t>
-      </w:r>
-      <w:r>
-        <w:rPr>
-          <w:sz w:val="22"/>
-        </w:rPr>
-        <w:t xml:space="preserve"> </w:t>
-      </w:r>
-      <w:r>
-        <w:rPr>
-          <w:sz w:val="22"/>
-        </w:rPr>
-        <w:t>ReactJS</w:t>
-      </w:r>
-      <w:r>
-        <w:rPr>
-          <w:sz w:val="22"/>
-        </w:rPr>
-        <w:t>,</w:t>
-      </w:r>
-      <w:r>
-        <w:rPr>
-          <w:sz w:val="22"/>
-        </w:rPr>
-        <w:t xml:space="preserve"> React Native,</w:t>
-      </w:r>
-      <w:r>
-        <w:rPr>
-          <w:sz w:val="22"/>
-        </w:rPr>
-        <w:t xml:space="preserve"> </w:t>
-      </w:r>
-      <w:r>
-        <w:rPr>
-          <w:sz w:val="22"/>
-        </w:rPr>
-        <w:t>NextJS</w:t>
-      </w:r>
-      <w:r>
-        <w:rPr>
-          <w:sz w:val="22"/>
-        </w:rPr>
-        <w:t>, Tailwind CSS, Bootstrap, Redux Toolkit, Zustand, Three.js</w:t>
-      </w:r>
-      <w:r>
-        <w:rPr>
-          <w:sz w:val="22"/>
-        </w:rPr>
+        </w:rPr>
+        <w:t>Frontend: ReactJS, NextJS, Tailwind CSS, Bootstrap, Redux Toolkit, Zustand, Three.js</w:t>
         <w:br/>
+        <w:t>Backend: NodeJS, NestJS, Express.js, REST APIs, Prisma ORM, JWT Authentication</w:t>
+      </w:r>
+      <w:r>
+        <w:rPr/>
+      </w:r>
+      <w:r>
+        <w:rPr/>
+      </w:r>
+      <w:r>
+        <w:rPr/>
+      </w:r>
+      <w:r>
+        <w:rPr/>
+      </w:r>
+      <w:r>
+        <w:rPr/>
+      </w:r>
+      <w:r>
+        <w:rPr/>
+      </w:r>
+      <w:r>
+        <w:rPr/>
+      </w:r>
+      <w:r>
+        <w:rPr/>
       </w:r>
       <w:r>
         <w:rPr>
           <w:b/>
           <w:bCs/>
-          <w:sz w:val="22"/>
-        </w:rPr>
-        <w:t>Backend:</w:t>
-      </w:r>
-      <w:r>
-        <w:rPr>
-          <w:sz w:val="22"/>
-        </w:rPr>
-        <w:t xml:space="preserve"> </w:t>
-      </w:r>
-      <w:r>
-        <w:rPr>
-          <w:sz w:val="22"/>
-        </w:rPr>
-        <w:t>NodeJS</w:t>
-      </w:r>
-      <w:r>
-        <w:rPr>
-          <w:sz w:val="22"/>
-        </w:rPr>
-        <w:t xml:space="preserve">, </w:t>
-      </w:r>
-      <w:r>
-        <w:rPr>
-          <w:sz w:val="22"/>
-        </w:rPr>
-        <w:t>NestJS</w:t>
-      </w:r>
-      <w:r>
-        <w:rPr>
-          <w:sz w:val="22"/>
-        </w:rPr>
-        <w:t>, Express.js, REST APIs, Prisma ORM, JWT Authentication</w:t>
+        </w:rPr>
+      </w:r>
+      <w:r>
+        <w:rPr/>
+      </w:r>
+      <w:r>
+        <w:rPr/>
+      </w:r>
+      <w:r>
+        <w:rPr/>
+      </w:r>
+      <w:r>
+        <w:rPr/>
+      </w:r>
+      <w:r>
+        <w:rPr/>
       </w:r>
     </w:p>
     <w:p>
       <w:pPr>
         <w:pStyle w:val="Space"/>
         <w:jc w:val="left"/>
-        <w:rPr>
-          <w:sz w:val="22"/>
-        </w:rPr>
+        <w:rPr/>
       </w:pPr>
       <w:r>
         <w:rPr>
           <w:b/>
           <w:bCs/>
-          <w:sz w:val="22"/>
         </w:rPr>
         <w:t>Databases:</w:t>
       </w:r>
       <w:r>
-        <w:rPr>
-          <w:sz w:val="22"/>
-        </w:rPr>
+        <w:rPr/>
         <w:t xml:space="preserve"> PostgreSQL, MySQL, MongoDB</w:t>
       </w:r>
       <w:r>
-        <w:rPr>
-          <w:sz w:val="22"/>
-        </w:rPr>
+        <w:rPr/>
         <w:br/>
       </w:r>
       <w:r>
         <w:rPr>
           <w:b/>
           <w:bCs/>
-          <w:sz w:val="22"/>
         </w:rPr>
         <w:t>Tools:</w:t>
       </w:r>
       <w:r>
-        <w:rPr>
-          <w:sz w:val="22"/>
-        </w:rPr>
+        <w:rPr/>
         <w:t xml:space="preserve"> Git, GitHub, Postman, Figma, Stripe, Tabby, Google Analytics, Meta Pixel</w:t>
       </w:r>
-    </w:p>
-    <w:p>
-      <w:pPr>
-        <w:pStyle w:val="Space"/>
-      </w:pPr>
     </w:p>
     <w:p>
       <w:pPr>
@@ -714,19 +621,6 @@
     </w:p>
     <w:p>
       <w:pPr>
-        <w:pStyle w:val="ListBullet"/>
-        <w:numPr>
-          <w:ilvl w:val="0"/>
-          <w:numId w:val="0"/>
-        </w:numPr>
-        <w:ind w:left="720"/>
-        <w:rPr>
-          <w:lang w:val="en-AE"/>
-        </w:rPr>
-      </w:pPr>
-    </w:p>
-    <w:p>
-      <w:pPr>
         <w:pStyle w:val="List"/>
       </w:pPr>
       <w:r>
@@ -877,29 +771,6 @@
         </w:rPr>
         <w:t>Collaborated with distributed teams to deliver production-ready features.</w:t>
       </w:r>
-    </w:p>
-    <w:p>
-      <w:pPr>
-        <w:pStyle w:val="ListBullet"/>
-        <w:numPr>
-          <w:ilvl w:val="0"/>
-          <w:numId w:val="0"/>
-        </w:numPr>
-        <w:ind w:left="1080" w:hanging="360"/>
-      </w:pPr>
-    </w:p>
-    <w:p>
-      <w:pPr>
-        <w:pStyle w:val="ListBullet"/>
-        <w:numPr>
-          <w:ilvl w:val="0"/>
-          <w:numId w:val="0"/>
-        </w:numPr>
-        <w:ind w:left="1080" w:hanging="360"/>
-        <w:rPr>
-          <w:lang w:val="en-AE"/>
-        </w:rPr>
-      </w:pPr>
     </w:p>
     <w:p>
       <w:pPr>
@@ -1026,42 +897,111 @@
     <w:p>
       <w:pPr>
         <w:pStyle w:val="List"/>
+      </w:pPr>
+      <w:r>
         <w:rPr>
           <w:b/>
           <w:iCs/>
         </w:rPr>
-      </w:pPr>
+        <w:lastRenderedPageBreak/>
+        <w:t>Frontend Developer</w:t>
+      </w:r>
+      <w:r>
+        <w:t xml:space="preserve"> | </w:t>
+      </w:r>
+      <w:r>
+        <w:t>Global Lean Industry (GLI) – Grwan</w:t>
+      </w:r>
+      <w:r>
+        <w:t xml:space="preserve"> </w:t>
+      </w:r>
+      <w:r>
+        <w:t>Group (Remote - UAE)</w:t>
+      </w:r>
+      <w:r>
+        <w:tab/>
+        <w:t>20</w:t>
+      </w:r>
+      <w:r>
+        <w:t>25</w:t>
+      </w:r>
+    </w:p>
+    <w:p>
+      <w:pPr>
+        <w:pStyle w:val="ListBullet"/>
+        <w:rPr>
+          <w:lang w:val="en-AE"/>
+        </w:rPr>
+      </w:pPr>
+      <w:r>
+        <w:rPr>
+          <w:lang w:val="en-AE"/>
+        </w:rPr>
+        <w:t xml:space="preserve">Developed enterprise applications with </w:t>
+      </w:r>
+      <w:r>
+        <w:rPr>
+          <w:lang w:val="en-AE"/>
+        </w:rPr>
+        <w:t>ReactJS</w:t>
+      </w:r>
+      <w:r>
+        <w:rPr>
+          <w:lang w:val="en-AE"/>
+        </w:rPr>
+        <w:t xml:space="preserve">, </w:t>
+      </w:r>
+      <w:r>
+        <w:rPr>
+          <w:lang w:val="en-AE"/>
+        </w:rPr>
+        <w:t>NextJS</w:t>
+      </w:r>
+      <w:r>
+        <w:rPr>
+          <w:lang w:val="en-AE"/>
+        </w:rPr>
+        <w:t xml:space="preserve">, and TypeScript. </w:t>
+      </w:r>
+    </w:p>
+    <w:p>
+      <w:pPr>
+        <w:pStyle w:val="ListBullet"/>
+      </w:pPr>
+      <w:r>
+        <w:rPr>
+          <w:lang w:val="en-AE"/>
+        </w:rPr>
+        <w:t>Improved application performance and created reusable UI components using Tailwind CSS.</w:t>
+      </w:r>
     </w:p>
     <w:p>
       <w:pPr>
         <w:pStyle w:val="List"/>
       </w:pPr>
+      <w:r/>
       <w:r>
         <w:rPr>
           <w:b/>
           <w:iCs/>
         </w:rPr>
-        <w:lastRenderedPageBreak/>
-        <w:t>Frontend Developer</w:t>
+        <w:t>Full Stack Developer</w:t>
       </w:r>
       <w:r>
         <w:t xml:space="preserve"> | </w:t>
       </w:r>
       <w:r>
-        <w:t>Global Lean Industry (GLI) – Grwan</w:t>
-      </w:r>
-      <w:r>
-        <w:t xml:space="preserve"> </w:t>
-      </w:r>
-      <w:r>
-        <w:t>Group (Remote - UAE)</w:t>
+        <w:t>Mark &amp; Success (Remote - Egypt)</w:t>
       </w:r>
       <w:r>
         <w:tab/>
         <w:t>20</w:t>
       </w:r>
       <w:r>
-        <w:t>25</w:t>
+        <w:t>2</w:t>
+      </w:r>
+      <w:r>
+        <w:t>4 - 2025</w:t>
       </w:r>
     </w:p>
     <w:p>
@@ -1075,13 +1015,13 @@
         <w:rPr>
           <w:lang w:val="en-AE"/>
         </w:rPr>
-        <w:t xml:space="preserve">Developed enterprise applications with </w:t>
-      </w:r>
-      <w:r>
-        <w:rPr>
-          <w:lang w:val="en-AE"/>
-        </w:rPr>
-        <w:t>ReactJS</w:t>
+        <w:t>Built full-stack features using React</w:t>
+      </w:r>
+      <w:r>
+        <w:rPr>
+          <w:lang w:val="en-AE"/>
+        </w:rPr>
+        <w:t>JS</w:t>
       </w:r>
       <w:r>
         <w:rPr>
@@ -1093,13 +1033,25 @@
         <w:rPr>
           <w:lang w:val="en-AE"/>
         </w:rPr>
-        <w:t>NextJS</w:t>
-      </w:r>
-      <w:r>
-        <w:rPr>
-          <w:lang w:val="en-AE"/>
-        </w:rPr>
-        <w:t xml:space="preserve">, and TypeScript. </w:t>
+        <w:t>NodeJS</w:t>
+      </w:r>
+      <w:r>
+        <w:rPr>
+          <w:lang w:val="en-AE"/>
+        </w:rPr>
+        <w:t xml:space="preserve">, </w:t>
+      </w:r>
+      <w:r>
+        <w:rPr>
+          <w:lang w:val="en-AE"/>
+        </w:rPr>
+        <w:t>NestJS</w:t>
+      </w:r>
+      <w:r>
+        <w:rPr>
+          <w:lang w:val="en-AE"/>
+        </w:rPr>
+        <w:t xml:space="preserve">, Express.js, and Prisma ORM. </w:t>
       </w:r>
     </w:p>
     <w:p>
@@ -1110,88 +1062,57 @@
         <w:rPr>
           <w:lang w:val="en-AE"/>
         </w:rPr>
-        <w:t>Improved application performance and created reusable UI components using Tailwind CSS.</w:t>
+        <w:t>Developed REST APIs and optimized backend performance.</w:t>
       </w:r>
     </w:p>
     <w:p>
       <w:pPr>
         <w:pStyle w:val="List"/>
       </w:pPr>
-      <w:r>
-        <w:br/>
-      </w:r>
       <w:r>
         <w:rPr>
           <w:b/>
           <w:iCs/>
         </w:rPr>
-        <w:t>Full Stack Developer</w:t>
+        <w:t>Frontend Developer</w:t>
       </w:r>
       <w:r>
         <w:t xml:space="preserve"> | </w:t>
       </w:r>
       <w:r>
-        <w:t>Mark &amp; Success (Remote - Egypt)</w:t>
+        <w:t xml:space="preserve">Rasid (Hybrid </w:t>
+      </w:r>
+      <w:r>
+        <w:t>– Cairo,</w:t>
+      </w:r>
+      <w:r>
+        <w:t xml:space="preserve"> Egypt)</w:t>
       </w:r>
       <w:r>
         <w:tab/>
-        <w:t>20</w:t>
-      </w:r>
-      <w:r>
-        <w:t>2</w:t>
-      </w:r>
-      <w:r>
-        <w:t>4 - 2025</w:t>
+      </w:r>
+      <w:r>
+        <w:t>2023 - 2025</w:t>
       </w:r>
     </w:p>
     <w:p>
       <w:pPr>
         <w:pStyle w:val="ListBullet"/>
-        <w:rPr>
-          <w:lang w:val="en-AE"/>
-        </w:rPr>
-      </w:pPr>
-      <w:r>
-        <w:rPr>
-          <w:lang w:val="en-AE"/>
-        </w:rPr>
-        <w:t>Built full-stack features using React</w:t>
-      </w:r>
-      <w:r>
-        <w:rPr>
-          <w:lang w:val="en-AE"/>
-        </w:rPr>
+      </w:pPr>
+      <w:r>
+        <w:t>Developed enterprise-level apps with React</w:t>
+      </w:r>
+      <w:r>
         <w:t>JS</w:t>
       </w:r>
       <w:r>
-        <w:rPr>
-          <w:lang w:val="en-AE"/>
-        </w:rPr>
-        <w:t xml:space="preserve">, </w:t>
-      </w:r>
-      <w:r>
-        <w:rPr>
-          <w:lang w:val="en-AE"/>
-        </w:rPr>
-        <w:t>NodeJS</w:t>
-      </w:r>
-      <w:r>
-        <w:rPr>
-          <w:lang w:val="en-AE"/>
-        </w:rPr>
-        <w:t xml:space="preserve">, </w:t>
-      </w:r>
-      <w:r>
-        <w:rPr>
-          <w:lang w:val="en-AE"/>
-        </w:rPr>
-        <w:t>NestJS</w:t>
-      </w:r>
-      <w:r>
-        <w:rPr>
-          <w:lang w:val="en-AE"/>
-        </w:rPr>
-        <w:t xml:space="preserve">, Express.js, and Prisma ORM. </w:t>
+        <w:t>/</w:t>
+      </w:r>
+      <w:r>
+        <w:t>NextJS</w:t>
+      </w:r>
+      <w:r>
+        <w:t>, serving 10+ teams.</w:t>
       </w:r>
     </w:p>
     <w:p>
@@ -1199,131 +1120,53 @@
         <w:pStyle w:val="ListBullet"/>
       </w:pPr>
       <w:r>
-        <w:rPr>
-          <w:lang w:val="en-AE"/>
-        </w:rPr>
-        <w:t>Developed REST APIs and optimized backend performance.</w:t>
+        <w:t xml:space="preserve">Built a facility management platform with real-time reporting, SOS, HR, and attendance tracking for </w:t>
+      </w:r>
+      <w:r>
+        <w:t>1</w:t>
+      </w:r>
+      <w:r>
+        <w:t>5,000+ users.</w:t>
+      </w:r>
+    </w:p>
+    <w:p>
+      <w:pPr>
+        <w:pStyle w:val="ListBullet"/>
+      </w:pPr>
+      <w:r>
+        <w:t>Designed a UI customization card builder, improving configuration efficiency by 40%.</w:t>
+      </w:r>
+    </w:p>
+    <w:p>
+      <w:pPr>
+        <w:pStyle w:val="ListBullet"/>
+      </w:pPr>
+      <w:r>
+        <w:rPr>
+          <w:lang w:val="en-AE"/>
+        </w:rPr>
+        <w:t>Integrated 3D facility monitoring with Three.js, reducing incident response time.</w:t>
+      </w:r>
+    </w:p>
+    <w:p>
+      <w:pPr>
+        <w:pStyle w:val="Heading1"/>
+      </w:pPr>
+      <w:r>
+        <w:t>Education</w:t>
       </w:r>
     </w:p>
     <w:p>
       <w:pPr>
         <w:pStyle w:val="List"/>
-        <w:rPr>
-          <w:b/>
-          <w:iCs/>
-        </w:rPr>
-      </w:pPr>
-    </w:p>
-    <w:p>
-      <w:pPr>
-        <w:pStyle w:val="List"/>
-      </w:pPr>
-      <w:r>
-        <w:rPr>
-          <w:b/>
-          <w:iCs/>
-        </w:rPr>
-        <w:t>Frontend Developer</w:t>
-      </w:r>
-      <w:r>
-        <w:t xml:space="preserve"> | </w:t>
-      </w:r>
-      <w:r>
-        <w:t xml:space="preserve">Rasid (Hybrid </w:t>
-      </w:r>
-      <w:r>
-        <w:t>– Cairo,</w:t>
-      </w:r>
-      <w:r>
-        <w:t xml:space="preserve"> Egypt)</w:t>
+      </w:pPr>
+      <w:r>
+        <w:t>Bachelor’s Degree in Accounting | Cairo University</w:t>
       </w:r>
       <w:r>
         <w:tab/>
       </w:r>
       <w:r>
-        <w:t>2023 - 2025</w:t>
-      </w:r>
-    </w:p>
-    <w:p>
-      <w:pPr>
-        <w:pStyle w:val="ListBullet"/>
-      </w:pPr>
-      <w:r>
-        <w:t>Developed enterprise-level apps with React</w:t>
-      </w:r>
-      <w:r>
-        <w:t>JS</w:t>
-      </w:r>
-      <w:r>
-        <w:t>/</w:t>
-      </w:r>
-      <w:r>
-        <w:t>NextJS</w:t>
-      </w:r>
-      <w:r>
-        <w:t>, serving 10+ teams.</w:t>
-      </w:r>
-    </w:p>
-    <w:p>
-      <w:pPr>
-        <w:pStyle w:val="ListBullet"/>
-      </w:pPr>
-      <w:r>
-        <w:t xml:space="preserve">Built a facility management platform with real-time reporting, SOS, HR, and attendance tracking for </w:t>
-      </w:r>
-      <w:r>
-        <w:t>1</w:t>
-      </w:r>
-      <w:r>
-        <w:t>5,000+ users.</w:t>
-      </w:r>
-    </w:p>
-    <w:p>
-      <w:pPr>
-        <w:pStyle w:val="ListBullet"/>
-      </w:pPr>
-      <w:r>
-        <w:t>Designed a UI customization card builder, improving configuration efficiency by 40%.</w:t>
-      </w:r>
-    </w:p>
-    <w:p>
-      <w:pPr>
-        <w:pStyle w:val="ListBullet"/>
-      </w:pPr>
-      <w:r>
-        <w:rPr>
-          <w:lang w:val="en-AE"/>
-        </w:rPr>
-        <w:t>Integrated 3D facility monitoring with Three.js, reducing incident response time.</w:t>
-      </w:r>
-    </w:p>
-    <w:p>
-      <w:pPr>
-        <w:pStyle w:val="List"/>
-        <w:rPr>
-          <w:lang w:val="en-AE"/>
-        </w:rPr>
-      </w:pPr>
-    </w:p>
-    <w:p>
-      <w:pPr>
-        <w:pStyle w:val="Heading1"/>
-      </w:pPr>
-      <w:r>
-        <w:t>Education</w:t>
-      </w:r>
-    </w:p>
-    <w:p>
-      <w:pPr>
-        <w:pStyle w:val="List"/>
-      </w:pPr>
-      <w:r>
-        <w:t>Bachelor’s Degree in Accounting | Cairo University</w:t>
-      </w:r>
-      <w:r>
-        <w:tab/>
-      </w:r>
-      <w:r>
         <w:t xml:space="preserve">2020 </w:t>
       </w:r>
       <w:r>
@@ -1333,12 +1176,9 @@
         <w:t xml:space="preserve"> 2024</w:t>
       </w:r>
     </w:p>
-    <w:p>
-      <w:pPr>
-        <w:pStyle w:val="List"/>
-      </w:pPr>
-    </w:p>
     <w:sectPr>
+      <w:headerReference w:type="default" r:id="rId16"/>
+      <w:footerReference w:type="default" r:id="rId17"/>
       <w:pgSz w:w="12240" w:h="15840" w:code="1"/>
       <w:pgMar w:top="720" w:right="720" w:bottom="720" w:left="720" w:header="706" w:footer="706" w:gutter="0"/>
       <w:cols w:space="708"/>
@@ -1373,6 +1213,16 @@
 </w:endnotes>
 </file>
 
+<file path=word/footer1.xml><?xml version="1.0" encoding="utf-8"?>
+<w:ftr xmlns:m="http://schemas.openxmlformats.org/officeDocument/2006/math" xmlns:mc="http://schemas.openxmlformats.org/markup-compatibility/2006" xmlns:mo="http://schemas.microsoft.com/office/mac/office/2008/main" xmlns:mv="urn:schemas-microsoft-com:mac:vml" xmlns:o="urn:schemas-microsoft-com:office:office" xmlns:r="http://schemas.openxmlformats.org/officeDocument/2006/relationships" xmlns:v="urn:schemas-microsoft-com:vml" xmlns:w10="urn:schemas-microsoft-com:office:word" xmlns:w14="http://schemas.microsoft.com/office/word/2010/wordml" xmlns:w="http://schemas.openxmlformats.org/wordprocessingml/2006/main" xmlns:wne="http://schemas.microsoft.com/office/word/2006/wordml" xmlns:wp14="http://schemas.microsoft.com/office/word/2010/wordprocessingDrawing" xmlns:wp="http://schemas.openxmlformats.org/drawingml/2006/wordprocessingDrawing" xmlns:wpc="http://schemas.microsoft.com/office/word/2010/wordprocessingCanvas" xmlns:wpg="http://schemas.microsoft.com/office/word/2010/wordprocessingGroup" xmlns:wpi="http://schemas.microsoft.com/office/word/2010/wordprocessingInk" xmlns:wps="http://schemas.microsoft.com/office/word/2010/wordprocessingShape" mc:Ignorable="w14 wp14">
+  <w:p>
+    <w:pPr>
+      <w:pStyle w:val="Footer"/>
+    </w:pPr>
+  </w:p>
+</w:ftr>
+</file>
+
 <file path=word/footnotes.xml><?xml version="1.0" encoding="utf-8"?>
 <w:footnotes xmlns:wpc="http://schemas.microsoft.com/office/word/2010/wordprocessingCanvas" xmlns:cx="http://schemas.microsoft.com/office/drawing/2014/chartex" xmlns:cx1="http://schemas.microsoft.com/office/drawing/2015/9/8/chartex" xmlns:cx2="http://schemas.microsoft.com/office/drawing/2015/10/21/chartex" xmlns:cx3="http://schemas.microsoft.com/office/drawing/2016/5/9/chartex" xmlns:cx4="http://schemas.microsoft.com/office/drawing/2016/5/10/chartex" xmlns:cx5="http://schemas.microsoft.com/office/drawing/2016/5/11/chartex" xmlns:cx6="http://schemas.microsoft.com/office/drawing/2016/5/12/chartex" xmlns:cx7="http://schemas.microsoft.com/office/drawing/2016/5/13/chartex" xmlns:cx8="http://schemas.microsoft.com/office/drawing/2016/5/14/chartex" xmlns:mc="http://schemas.openxmlformats.org/markup-compatibility/2006" xmlns:aink="http://schemas.microsoft.com/office/drawing/2016/ink" xmlns:am3d="http://schemas.microsoft.com/office/drawing/2017/model3d" xmlns:o="urn:schemas-microsoft-com:office:office" xmlns:oel="http://schemas.microsoft.com/office/2019/extlst" xmlns:r="http://schemas.openxmlformats.org/officeDocument/2006/relationships" xmlns:m="http://schemas.openxmlformats.org/officeDocument/2006/math" xmlns:v="urn:schemas-microsoft-com:vml" xmlns:wp14="http://schemas.microsoft.com/office/word/2010/wordprocessingDrawing" xmlns:wp="http://schemas.openxmlformats.org/drawingml/2006/wordprocessingDrawing" xmlns:w10="urn:schemas-microsoft-com:office:word" xmlns:w="http://schemas.openxmlformats.org/wordprocessingml/2006/main" xmlns:w14="http://schemas.microsoft.com/office/word/2010/wordml" xmlns:w15="http://schemas.microsoft.com/office/word/2012/wordml" xmlns:w16cex="http://schemas.microsoft.com/office/word/2018/wordml/cex" xmlns:w16cid="http://schemas.microsoft.com/office/word/2016/wordml/cid" xmlns:w16="http://schemas.microsoft.com/office/word/2018/wordml" xmlns:w16du="http://schemas.microsoft.com/office/word/2023/wordml/word16du" xmlns:w16sdtdh="http://schemas.microsoft.com/office/word/2020/wordml/sdtdatahash" xmlns:w16sdtfl="http://schemas.microsoft.com/office/word/2024/wordml/sdtformatlock" xmlns:w16se="http://schemas.microsoft.com/office/word/2015/wordml/symex" xmlns:wpg="http://schemas.microsoft.com/office/word/2010/wordprocessingGroup" xmlns:wpi="http://schemas.microsoft.com/office/word/2010/wordprocessingInk" xmlns:wne="http://schemas.microsoft.com/office/word/2006/wordml" xmlns:wps="http://schemas.microsoft.com/office/word/2010/wordprocessingShape" mc:Ignorable="w14 w15 w16se w16cid w16 w16cex w16sdtdh w16sdtfl w16du wp14">
   <w:footnote w:type="separator" w:id="-1">
@@ -1396,6 +1246,16 @@
     </w:p>
   </w:footnote>
 </w:footnotes>
+</file>
+
+<file path=word/header1.xml><?xml version="1.0" encoding="utf-8"?>
+<w:hdr xmlns:m="http://schemas.openxmlformats.org/officeDocument/2006/math" xmlns:mc="http://schemas.openxmlformats.org/markup-compatibility/2006" xmlns:mo="http://schemas.microsoft.com/office/mac/office/2008/main" xmlns:mv="urn:schemas-microsoft-com:mac:vml" xmlns:o="urn:schemas-microsoft-com:office:office" xmlns:r="http://schemas.openxmlformats.org/officeDocument/2006/relationships" xmlns:v="urn:schemas-microsoft-com:vml" xmlns:w10="urn:schemas-microsoft-com:office:word" xmlns:w14="http://schemas.microsoft.com/office/word/2010/wordml" xmlns:w="http://schemas.openxmlformats.org/wordprocessingml/2006/main" xmlns:wne="http://schemas.microsoft.com/office/word/2006/wordml" xmlns:wp14="http://schemas.microsoft.com/office/word/2010/wordprocessingDrawing" xmlns:wp="http://schemas.openxmlformats.org/drawingml/2006/wordprocessingDrawing" xmlns:wpc="http://schemas.microsoft.com/office/word/2010/wordprocessingCanvas" xmlns:wpg="http://schemas.microsoft.com/office/word/2010/wordprocessingGroup" xmlns:wpi="http://schemas.microsoft.com/office/word/2010/wordprocessingInk" xmlns:wps="http://schemas.microsoft.com/office/word/2010/wordprocessingShape" mc:Ignorable="w14 wp14">
+  <w:p>
+    <w:pPr>
+      <w:pStyle w:val="Header"/>
+    </w:pPr>
+  </w:p>
+</w:hdr>
 </file>
 
 <file path=word/numbering.xml><?xml version="1.0" encoding="utf-8"?>
@@ -2200,15 +2060,16 @@
   <w:docDefaults>
     <w:rPrDefault>
       <w:rPr>
-        <w:rFonts w:asciiTheme="minorHAnsi" w:eastAsiaTheme="minorHAnsi" w:hAnsiTheme="minorHAnsi" w:cstheme="minorBidi"/>
-        <w:sz w:val="22"/>
-        <w:szCs w:val="22"/>
+        <w:rFonts w:ascii="Calibri" w:hAnsi="Calibri" w:cs="Calibri" w:eastAsia="Calibri"/>
+        <w:color w:val="1A1A1A"/>
+        <w:sz w:val="21"/>
+        <w:szCs w:val="21"/>
         <w:lang w:val="en-IN" w:eastAsia="en-US" w:bidi="ar-SA"/>
       </w:rPr>
     </w:rPrDefault>
     <w:pPrDefault>
       <w:pPr>
-        <w:spacing w:after="160" w:line="259" w:lineRule="auto"/>
+        <w:spacing w:before="0" w:after="0" w:line="240" w:lineRule="auto"/>
       </w:pPr>
     </w:pPrDefault>
   </w:docDefaults>
@@ -2590,12 +2451,13 @@
     <w:qFormat/>
     <w:rsid w:val="00EE1630"/>
     <w:pPr>
-      <w:spacing w:after="0"/>
+      <w:spacing w:before="0" w:after="0" w:line="240" w:lineRule="auto"/>
       <w:jc w:val="both"/>
     </w:pPr>
     <w:rPr>
-      <w:color w:val="747474" w:themeColor="background2" w:themeShade="80"/>
-      <w:position w:val="8"/>
+      <w:color w:val="1A1A1A"/>
+      <w:sz w:val="21"/>
+      <w:szCs w:val="21"/>
       <w:lang w:val="en-US"/>
     </w:rPr>
   </w:style>
@@ -2608,16 +2470,16 @@
     <w:qFormat/>
     <w:rsid w:val="00EA2625"/>
     <w:pPr>
-      <w:spacing w:after="80"/>
+      <w:spacing w:before="70" w:after="30" w:line="240" w:lineRule="auto"/>
       <w:outlineLvl w:val="0"/>
     </w:pPr>
     <w:rPr>
-      <w:rFonts w:cs="Open Sans"/>
+      <w:rFonts w:ascii="Calibri" w:hAnsi="Calibri" w:cs="Calibri" w:eastAsia="Calibri"/>
       <w:b/>
       <w:caps/>
-      <w:color w:val="262626" w:themeColor="text1" w:themeTint="D9"/>
-      <w:sz w:val="26"/>
-      <w:szCs w:val="24"/>
+      <w:color w:val="111111"/>
+      <w:sz w:val="23"/>
+      <w:szCs w:val="23"/>
     </w:rPr>
   </w:style>
   <w:style w:type="paragraph" w:styleId="Heading2">
@@ -2633,14 +2495,14 @@
     <w:pPr>
       <w:keepNext/>
       <w:keepLines/>
-      <w:spacing w:before="40"/>
+      <w:spacing w:before="0" w:after="0" w:line="240" w:lineRule="auto"/>
       <w:outlineLvl w:val="1"/>
     </w:pPr>
     <w:rPr>
-      <w:rFonts w:asciiTheme="majorHAnsi" w:eastAsiaTheme="majorEastAsia" w:hAnsiTheme="majorHAnsi" w:cstheme="majorBidi"/>
-      <w:color w:val="002040" w:themeColor="accent1" w:themeShade="BF"/>
-      <w:sz w:val="26"/>
-      <w:szCs w:val="26"/>
+      <w:rFonts w:ascii="Calibri" w:hAnsi="Calibri" w:cs="Calibri" w:eastAsia="Calibri"/>
+      <w:color w:val="1A1A1A"/>
+      <w:sz w:val="21"/>
+      <w:szCs w:val="21"/>
     </w:rPr>
   </w:style>
   <w:style w:type="character" w:default="1" w:styleId="DefaultParagraphFont">
@@ -2681,7 +2543,7 @@
         <w:tab w:val="center" w:pos="4513"/>
         <w:tab w:val="right" w:pos="9026"/>
       </w:tabs>
-      <w:spacing w:line="240" w:lineRule="auto"/>
+      <w:spacing w:before="0" w:after="0" w:line="240" w:lineRule="auto"/>
     </w:pPr>
   </w:style>
   <w:style w:type="character" w:customStyle="1" w:styleId="HeaderChar">
@@ -2692,9 +2554,9 @@
     <w:semiHidden/>
     <w:rsid w:val="00E5133F"/>
     <w:rPr>
-      <w:color w:val="747474" w:themeColor="background2" w:themeShade="80"/>
-      <w:position w:val="8"/>
-      <w:sz w:val="24"/>
+      <w:color w:val="1A1A1A"/>
+      <w:sz w:val="21"/>
+      <w:szCs w:val="21"/>
     </w:rPr>
   </w:style>
   <w:style w:type="paragraph" w:styleId="Footer">
@@ -2709,7 +2571,7 @@
         <w:tab w:val="center" w:pos="4513"/>
         <w:tab w:val="right" w:pos="9026"/>
       </w:tabs>
-      <w:spacing w:line="240" w:lineRule="auto"/>
+      <w:spacing w:before="0" w:after="0" w:line="240" w:lineRule="auto"/>
     </w:pPr>
   </w:style>
   <w:style w:type="character" w:customStyle="1" w:styleId="FooterChar">
@@ -2720,9 +2582,9 @@
     <w:semiHidden/>
     <w:rsid w:val="00E5133F"/>
     <w:rPr>
-      <w:color w:val="747474" w:themeColor="background2" w:themeShade="80"/>
-      <w:position w:val="8"/>
-      <w:sz w:val="24"/>
+      <w:color w:val="1A1A1A"/>
+      <w:sz w:val="21"/>
+      <w:szCs w:val="21"/>
     </w:rPr>
   </w:style>
   <w:style w:type="character" w:styleId="Hyperlink">
@@ -2732,7 +2594,9 @@
     <w:unhideWhenUsed/>
     <w:rsid w:val="00EF270B"/>
     <w:rPr>
-      <w:color w:val="467886" w:themeColor="hyperlink"/>
+      <w:color w:val="1A1A1A"/>
+      <w:sz w:val="21"/>
+      <w:szCs w:val="21"/>
       <w:u w:val="single"/>
     </w:rPr>
   </w:style>
@@ -2744,7 +2608,9 @@
     <w:unhideWhenUsed/>
     <w:rsid w:val="00EF270B"/>
     <w:rPr>
-      <w:color w:val="605E5C"/>
+      <w:color w:val="1A1A1A"/>
+      <w:sz w:val="21"/>
+      <w:szCs w:val="21"/>
       <w:shd w:val="clear" w:color="auto" w:fill="E1DFDD"/>
     </w:rPr>
   </w:style>
@@ -2756,7 +2622,7 @@
     <w:qFormat/>
     <w:rsid w:val="00224CF9"/>
     <w:pPr>
-      <w:spacing w:line="240" w:lineRule="auto"/>
+      <w:spacing w:before="0" w:after="0" w:line="240" w:lineRule="auto"/>
       <w:ind w:left="720"/>
       <w:contextualSpacing/>
       <w:jc w:val="center"/>
@@ -2768,11 +2634,13 @@
     <w:semiHidden/>
     <w:rsid w:val="00224CF9"/>
     <w:pPr>
-      <w:spacing w:before="100" w:beforeAutospacing="1" w:after="100" w:afterAutospacing="1" w:line="240" w:lineRule="auto"/>
+      <w:spacing w:before="0" w:after="0" w:line="240" w:lineRule="auto"/>
     </w:pPr>
     <w:rPr>
-      <w:rFonts w:ascii="Times New Roman" w:eastAsia="Times New Roman" w:hAnsi="Times New Roman" w:cs="Times New Roman"/>
-      <w:szCs w:val="24"/>
+      <w:rFonts w:ascii="Calibri" w:hAnsi="Calibri" w:cs="Calibri" w:eastAsia="Calibri"/>
+      <w:color w:val="1A1A1A"/>
+      <w:sz w:val="21"/>
+      <w:szCs w:val="21"/>
       <w:lang w:eastAsia="en-IN"/>
     </w:rPr>
   </w:style>
@@ -2785,17 +2653,16 @@
     <w:qFormat/>
     <w:rsid w:val="000164ED"/>
     <w:pPr>
-      <w:spacing w:after="60" w:line="240" w:lineRule="auto"/>
+      <w:spacing w:before="0" w:after="0" w:line="240" w:lineRule="auto"/>
       <w:contextualSpacing/>
     </w:pPr>
     <w:rPr>
-      <w:rFonts w:asciiTheme="majorHAnsi" w:eastAsiaTheme="majorEastAsia" w:hAnsiTheme="majorHAnsi" w:cstheme="majorBidi"/>
+      <w:rFonts w:ascii="Calibri" w:hAnsi="Calibri" w:cs="Calibri" w:eastAsia="Calibri"/>
       <w:b/>
       <w:caps/>
-      <w:color w:val="3A3A3A" w:themeColor="background2" w:themeShade="40"/>
-      <w:spacing w:val="20"/>
-      <w:sz w:val="44"/>
-      <w:szCs w:val="56"/>
+      <w:color w:val="1A1A1A"/>
+      <w:sz w:val="21"/>
+      <w:szCs w:val="21"/>
     </w:rPr>
   </w:style>
   <w:style w:type="character" w:customStyle="1" w:styleId="TitleChar">
@@ -2805,14 +2672,12 @@
     <w:uiPriority w:val="10"/>
     <w:rsid w:val="000164ED"/>
     <w:rPr>
-      <w:rFonts w:asciiTheme="majorHAnsi" w:eastAsiaTheme="majorEastAsia" w:hAnsiTheme="majorHAnsi" w:cstheme="majorBidi"/>
+      <w:rFonts w:ascii="Calibri" w:hAnsi="Calibri" w:cs="Calibri" w:eastAsia="Calibri"/>
       <w:b/>
       <w:caps/>
-      <w:color w:val="3A3A3A" w:themeColor="background2" w:themeShade="40"/>
-      <w:spacing w:val="20"/>
-      <w:position w:val="8"/>
-      <w:sz w:val="44"/>
-      <w:szCs w:val="56"/>
+      <w:color w:val="1A1A1A"/>
+      <w:sz w:val="21"/>
+      <w:szCs w:val="21"/>
       <w:lang w:val="en-US"/>
     </w:rPr>
   </w:style>
@@ -2825,14 +2690,14 @@
     <w:qFormat/>
     <w:rsid w:val="00E5133F"/>
     <w:pPr>
-      <w:spacing w:after="60" w:line="240" w:lineRule="auto"/>
+      <w:spacing w:before="0" w:after="0" w:line="240" w:lineRule="auto"/>
     </w:pPr>
     <w:rPr>
-      <w:rFonts w:cs="Open Sans"/>
+      <w:rFonts w:ascii="Calibri" w:hAnsi="Calibri" w:cs="Calibri" w:eastAsia="Calibri"/>
       <w:caps/>
-      <w:color w:val="3A3A3A" w:themeColor="background2" w:themeShade="40"/>
-      <w:spacing w:val="20"/>
-      <w:szCs w:val="28"/>
+      <w:color w:val="1A1A1A"/>
+      <w:sz w:val="21"/>
+      <w:szCs w:val="21"/>
     </w:rPr>
   </w:style>
   <w:style w:type="character" w:customStyle="1" w:styleId="SubtitleChar">
@@ -2842,13 +2707,11 @@
     <w:uiPriority w:val="11"/>
     <w:rsid w:val="00E5133F"/>
     <w:rPr>
-      <w:rFonts w:cs="Open Sans"/>
+      <w:rFonts w:ascii="Calibri" w:hAnsi="Calibri" w:cs="Calibri" w:eastAsia="Calibri"/>
       <w:caps/>
-      <w:color w:val="3A3A3A" w:themeColor="background2" w:themeShade="40"/>
-      <w:spacing w:val="20"/>
-      <w:position w:val="8"/>
-      <w:sz w:val="24"/>
-      <w:szCs w:val="28"/>
+      <w:color w:val="1A1A1A"/>
+      <w:sz w:val="21"/>
+      <w:szCs w:val="21"/>
     </w:rPr>
   </w:style>
   <w:style w:type="paragraph" w:styleId="Date">
@@ -2860,8 +2723,10 @@
     <w:semiHidden/>
     <w:rsid w:val="00E5133F"/>
     <w:rPr>
-      <w:rFonts w:ascii="Open Sans" w:hAnsi="Open Sans" w:cs="Open Sans"/>
-      <w:szCs w:val="24"/>
+      <w:rFonts w:ascii="Calibri" w:hAnsi="Calibri" w:cs="Calibri" w:eastAsia="Calibri"/>
+      <w:color w:val="1A1A1A"/>
+      <w:sz w:val="21"/>
+      <w:szCs w:val="21"/>
     </w:rPr>
   </w:style>
   <w:style w:type="character" w:customStyle="1" w:styleId="DateChar">
@@ -2872,11 +2737,10 @@
     <w:semiHidden/>
     <w:rsid w:val="006B04B2"/>
     <w:rPr>
-      <w:rFonts w:ascii="Open Sans" w:hAnsi="Open Sans" w:cs="Open Sans"/>
-      <w:color w:val="747474" w:themeColor="background2" w:themeShade="80"/>
-      <w:position w:val="8"/>
-      <w:sz w:val="24"/>
-      <w:szCs w:val="24"/>
+      <w:rFonts w:ascii="Calibri" w:hAnsi="Calibri" w:cs="Calibri" w:eastAsia="Calibri"/>
+      <w:color w:val="1A1A1A"/>
+      <w:sz w:val="21"/>
+      <w:szCs w:val="21"/>
       <w:lang w:val="en-US"/>
     </w:rPr>
   </w:style>
@@ -2887,13 +2751,12 @@
     <w:uiPriority w:val="9"/>
     <w:rsid w:val="00EA2625"/>
     <w:rPr>
-      <w:rFonts w:cs="Open Sans"/>
+      <w:rFonts w:ascii="Calibri" w:hAnsi="Calibri" w:cs="Calibri" w:eastAsia="Calibri"/>
       <w:b/>
       <w:caps/>
-      <w:color w:val="262626" w:themeColor="text1" w:themeTint="D9"/>
-      <w:position w:val="8"/>
-      <w:sz w:val="26"/>
-      <w:szCs w:val="24"/>
+      <w:color w:val="111111"/>
+      <w:sz w:val="23"/>
+      <w:szCs w:val="23"/>
       <w:lang w:val="en-US"/>
     </w:rPr>
   </w:style>
@@ -2905,8 +2768,10 @@
     <w:semiHidden/>
     <w:rsid w:val="00E5133F"/>
     <w:rPr>
-      <w:rFonts w:ascii="Open Sans" w:hAnsi="Open Sans" w:cs="Open Sans"/>
-      <w:szCs w:val="24"/>
+      <w:rFonts w:ascii="Calibri" w:hAnsi="Calibri" w:cs="Calibri" w:eastAsia="Calibri"/>
+      <w:color w:val="1A1A1A"/>
+      <w:sz w:val="21"/>
+      <w:szCs w:val="21"/>
     </w:rPr>
   </w:style>
   <w:style w:type="character" w:customStyle="1" w:styleId="ClosingChar">
@@ -2917,11 +2782,10 @@
     <w:semiHidden/>
     <w:rsid w:val="006B04B2"/>
     <w:rPr>
-      <w:rFonts w:ascii="Open Sans" w:hAnsi="Open Sans" w:cs="Open Sans"/>
-      <w:color w:val="747474" w:themeColor="background2" w:themeShade="80"/>
-      <w:position w:val="8"/>
-      <w:sz w:val="24"/>
-      <w:szCs w:val="24"/>
+      <w:rFonts w:ascii="Calibri" w:hAnsi="Calibri" w:cs="Calibri" w:eastAsia="Calibri"/>
+      <w:color w:val="1A1A1A"/>
+      <w:sz w:val="21"/>
+      <w:szCs w:val="21"/>
       <w:lang w:val="en-US"/>
     </w:rPr>
   </w:style>
@@ -2933,8 +2797,10 @@
     <w:semiHidden/>
     <w:rsid w:val="00E5133F"/>
     <w:rPr>
-      <w:rFonts w:ascii="Open Sans" w:hAnsi="Open Sans" w:cs="Open Sans"/>
-      <w:szCs w:val="24"/>
+      <w:rFonts w:ascii="Calibri" w:hAnsi="Calibri" w:cs="Calibri" w:eastAsia="Calibri"/>
+      <w:color w:val="1A1A1A"/>
+      <w:sz w:val="21"/>
+      <w:szCs w:val="21"/>
     </w:rPr>
   </w:style>
   <w:style w:type="character" w:customStyle="1" w:styleId="SignatureChar">
@@ -2945,11 +2811,10 @@
     <w:semiHidden/>
     <w:rsid w:val="006B04B2"/>
     <w:rPr>
-      <w:rFonts w:ascii="Open Sans" w:hAnsi="Open Sans" w:cs="Open Sans"/>
-      <w:color w:val="747474" w:themeColor="background2" w:themeShade="80"/>
-      <w:position w:val="8"/>
-      <w:sz w:val="24"/>
-      <w:szCs w:val="24"/>
+      <w:rFonts w:ascii="Calibri" w:hAnsi="Calibri" w:cs="Calibri" w:eastAsia="Calibri"/>
+      <w:color w:val="1A1A1A"/>
+      <w:sz w:val="21"/>
+      <w:szCs w:val="21"/>
       <w:lang w:val="en-US"/>
     </w:rPr>
   </w:style>
@@ -2962,9 +2827,12 @@
       <w:tabs>
         <w:tab w:val="right" w:pos="10800"/>
       </w:tabs>
+      <w:spacing w:before="0" w:after="0" w:line="240" w:lineRule="auto"/>
     </w:pPr>
     <w:rPr>
-      <w:sz w:val="24"/>
+      <w:color w:val="1A1A1A"/>
+      <w:sz w:val="21"/>
+      <w:szCs w:val="21"/>
     </w:rPr>
   </w:style>
   <w:style w:type="paragraph" w:styleId="ListBullet">
@@ -2976,7 +2844,7 @@
       <w:numPr>
         <w:numId w:val="5"/>
       </w:numPr>
-      <w:spacing w:line="240" w:lineRule="auto"/>
+      <w:spacing w:before="0" w:after="0" w:line="240" w:lineRule="auto"/>
       <w:ind w:left="1080"/>
       <w:contextualSpacing/>
     </w:pPr>
@@ -2991,6 +2859,9 @@
       <w:b/>
       <w:i w:val="0"/>
       <w:iCs/>
+      <w:color w:val="1A1A1A"/>
+      <w:sz w:val="21"/>
+      <w:szCs w:val="21"/>
     </w:rPr>
   </w:style>
   <w:style w:type="paragraph" w:customStyle="1" w:styleId="Space">
@@ -2999,7 +2870,9 @@
     <w:qFormat/>
     <w:rsid w:val="00EA2625"/>
     <w:rPr>
-      <w:sz w:val="14"/>
+      <w:color w:val="1A1A1A"/>
+      <w:sz w:val="21"/>
+      <w:szCs w:val="21"/>
     </w:rPr>
   </w:style>
   <w:style w:type="character" w:customStyle="1" w:styleId="Heading2Char">
@@ -3010,11 +2883,10 @@
     <w:semiHidden/>
     <w:rsid w:val="001E5B9E"/>
     <w:rPr>
-      <w:rFonts w:asciiTheme="majorHAnsi" w:eastAsiaTheme="majorEastAsia" w:hAnsiTheme="majorHAnsi" w:cstheme="majorBidi"/>
-      <w:color w:val="002040" w:themeColor="accent1" w:themeShade="BF"/>
-      <w:position w:val="8"/>
-      <w:sz w:val="26"/>
-      <w:szCs w:val="26"/>
+      <w:rFonts w:ascii="Calibri" w:hAnsi="Calibri" w:cs="Calibri" w:eastAsia="Calibri"/>
+      <w:color w:val="1A1A1A"/>
+      <w:sz w:val="21"/>
+      <w:szCs w:val="21"/>
       <w:lang w:val="en-US"/>
     </w:rPr>
   </w:style>
@@ -3064,12 +2936,12 @@
     </a:clrScheme>
     <a:fontScheme name="Custom 13">
       <a:majorFont>
-        <a:latin typeface="Baskerville Old Face"/>
+        <a:latin typeface="Calibri"/>
         <a:ea typeface=""/>
         <a:cs typeface=""/>
       </a:majorFont>
       <a:minorFont>
-        <a:latin typeface="Aptos"/>
+        <a:latin typeface="Calibri"/>
         <a:ea typeface=""/>
         <a:cs typeface=""/>
       </a:minorFont>

</xml_diff>